<commit_message>
docs: actualiza equipo y responsables a Felipe y Jafet
</commit_message>
<xml_diff>
--- a/Archivos Proyecto Integrado/02 Informes Word/Informe_Delicias_de_Mama_Incremental_Nube_Continuidad.docx
+++ b/Archivos Proyecto Integrado/02 Informes Word/Informe_Delicias_de_Mama_Incremental_Nube_Continuidad.docx
@@ -74,7 +74,7 @@
           <w:color w:val="000000"/>
           <w:sz w:val="22"/>
         </w:rPr>
-        <w:t>NOMBRE: Felipe Alvarado, Matias Otero, Jafet Lavados</w:t>
+        <w:t>NOMBRE: Felipe Alvarado y Jafet Lavados</w:t>
         <w:br/>
         <w:t>CARRERA: Analista Programador</w:t>
         <w:br/>
@@ -3881,7 +3881,7 @@
           <w:color w:val="000000"/>
           <w:sz w:val="22"/>
         </w:rPr>
-        <w:t>El equipo registrado está integrado por Felipe Alvarado, Matias Otero y Jafet Lavados, de Analista Programador. Proponemos a Felipe en requisitos y validación; Matias en interfaz e implementación Android; y Jafet en datos, despliegue y continuidad. Todos participarán en revisión y pruebas. Esta distribución se someterá a las indicaciones del docente, sin atribuirle una aprobación aún no registrada.</w:t>
+        <w:t>El equipo registrado está integrado por Felipe Alvarado y Jafet Lavados, de Analista Programador. Proponemos a Felipe en requisitos, interfaz e implementación Android; y Jafet en datos, despliegue y continuidad, con validación compartida. Todos participarán en revisión y pruebas. Esta distribución se someterá a las indicaciones del docente, sin atribuirle una aprobación aún no registrada.</w:t>
       </w:r>
     </w:p>
     <w:p>
@@ -5327,7 +5327,7 @@
                 <w:color w:val="000000"/>
                 <w:sz w:val="20"/>
               </w:rPr>
-              <w:t>Jafet y Matias identifican migración y bloqueo, preservan registros y corrigen con revisión de otro integrante. Restauran solo si hay pérdida o corrupción comprobada.</w:t>
+              <w:t>Jafet y Felipe identifican migración y bloqueo, preservan registros y corrigen con revisión de otro integrante. Restauran solo si hay pérdida o corrupción comprobada.</w:t>
             </w:r>
           </w:p>
         </w:tc>

</xml_diff>